<commit_message>
Make WVU DSPIRA branding prominent on the cradle guide
</commit_message>
<xml_diff>
--- a/assets/lessons/horn-construction/cradle-assembly-2021.docx
+++ b/assets/lessons/horn-construction/cradle-assembly-2021.docx
@@ -709,7 +709,7 @@
       <w:headerReference w:type="default" r:id="rId9"/>
       <w:footerReference w:type="default" r:id="rId10"/>
       <w:pgSz w:w="12240" w:h="15840"/>
-      <w:pgMar w:top="1080" w:right="1080" w:bottom="1080" w:left="1080" w:header="432" w:footer="432" w:gutter="0"/>
+      <w:pgMar w:top="1512" w:right="1080" w:bottom="1080" w:left="1080" w:header="432" w:footer="432" w:gutter="0"/>
       <w:cols w:space="720"/>
       <w:docGrid w:linePitch="360"/>
     </w:sectPr>
@@ -752,15 +752,32 @@
     <w:pPr>
       <w:pStyle w:val="Header"/>
       <w:tabs>
-        <w:tab w:pos="10080" w:val="right"/>
+        <w:tab w:pos="9821" w:val="right"/>
       </w:tabs>
+      <w:spacing w:before="0" w:after="0" w:lineRule="exact" w:line="600"/>
+      <w:shd w:val="clear" w:fill="002855"/>
+      <w:pBdr>
+        <w:bottom w:val="single" w:sz="16" w:space="0" w:color="EEAA00"/>
+      </w:pBdr>
     </w:pPr>
     <w:r>
       <w:rPr>
-        <w:b/>
-        <w:color w:val="002855"/>
-      </w:rPr>
-      <w:t>WVU DSPIRA</w:t>
+        <w:rFonts w:ascii="Arial" w:hAnsi="Arial"/>
+        <w:b/>
+        <w:color w:val="FFFFFF"/>
+        <w:sz w:val="32"/>
+      </w:rPr>
+      <w:t xml:space="preserve">  WVU DSPIRA</w:t>
+    </w:r>
+    <w:r>
+      <w:rPr>
+        <w:rFonts w:ascii="Arial" w:hAnsi="Arial"/>
+        <w:b w:val="0"/>
+        <w:color w:val="FFFFFF"/>
+        <w:sz w:val="18"/>
+      </w:rPr>
+      <w:tab/>
+      <w:t>WEST VIRGINIA UNIVERSITY</w:t>
     </w:r>
   </w:p>
 </w:hdr>

</xml_diff>